<commit_message>
scotus amicus-brief docx: page size within LibreOffice rounding; vendored fonts visible to soffice (fb-595.52)
DEF-FORM-001: reference.docx already sets 8820 x 13320 twips (441 x 666 pt, Rule 33.1(a)),
but LibreOffice keeps page sizes in whole 1/100 mm, so 6 1/8 in comes out 441.014 pt and no
twip value gives 441.000. page_size (native.rs and the lib.sh bridge) now accepts one such
unit (72/2540 pt) of difference, and nothing more.

DEF-FONT-002: soffice saw only the host fontconfig, so TeX Gyre Schola fell back to DejaVu
Serif. convert() now points FONTCONFIG_FILE at a generated fonts.conf that includes the host
config and adds fonts/ and the pinned Times New Roman dir (lofonts.rs, with an fc-match test).

amicus-brief and cert-petition docx are now green (6/6); ninth-circuit docx output unchanged.
</commit_message>
<xml_diff>
--- a/courts/supreme-court-of-the-united-states/cert-petition/usage/OUTPUT-cert-petition.docx
+++ b/courts/supreme-court-of-the-united-states/cert-petition/usage/OUTPUT-cert-petition.docx
@@ -1862,7 +1862,7 @@
           <w:sz w:val="24"/>
           <w:szCs w:val="24"/>
         </w:rPr>
-        <w:t xml:space="preserve">7</w:t>
+        <w:t xml:space="preserve">8</w:t>
       </w:r>
     </w:p>
     <w:p>
@@ -1929,7 +1929,7 @@
           <w:sz w:val="24"/>
           <w:szCs w:val="24"/>
         </w:rPr>
-        <w:t xml:space="preserve">7</w:t>
+        <w:t xml:space="preserve">8</w:t>
       </w:r>
     </w:p>
     <w:p>
@@ -1967,7 +1967,7 @@
           <w:sz w:val="24"/>
           <w:szCs w:val="24"/>
         </w:rPr>
-        <w:t xml:space="preserve">2</w:t>
+        <w:t xml:space="preserve">3</w:t>
       </w:r>
     </w:p>
     <w:p>
@@ -2005,7 +2005,7 @@
           <w:sz w:val="24"/>
           <w:szCs w:val="24"/>
         </w:rPr>
-        <w:t xml:space="preserve">6</w:t>
+        <w:t xml:space="preserve">7</w:t>
       </w:r>
     </w:p>
     <w:p>
@@ -2043,7 +2043,7 @@
           <w:sz w:val="24"/>
           <w:szCs w:val="24"/>
         </w:rPr>
-        <w:t xml:space="preserve">6</w:t>
+        <w:t xml:space="preserve">7</w:t>
       </w:r>
     </w:p>
     <w:p>
@@ -2137,7 +2137,7 @@
           <w:sz w:val="24"/>
           <w:szCs w:val="24"/>
         </w:rPr>
-        <w:t xml:space="preserve">4</w:t>
+        <w:t xml:space="preserve">5</w:t>
       </w:r>
     </w:p>
     <w:p>

</xml_diff>

<commit_message>
scotus cert-petition docx: scotus.lua on fb render's shared multi-pass path (needles in document order, #section numbering, rIdFtrNone/rIdFtrPage footers, FORMBOOK_FINAL); retire docx/render.sh and its 35-branch .shell-safety-baseline.json entry; TOC/TOA page labels now match the PDF (Conclusion 7, Fisher 2, Grutter 6, Schuette 6, Croson 7, Tex. Educ. Code 4); re-render and stamp (fb-595.66)
</commit_message>
<xml_diff>
--- a/courts/supreme-court-of-the-united-states/cert-petition/usage/OUTPUT-cert-petition.docx
+++ b/courts/supreme-court-of-the-united-states/cert-petition/usage/OUTPUT-cert-petition.docx
@@ -1515,7 +1515,7 @@
       <w:pPr>
         <w:pStyle w:val="SectionEnd"/>
         <w:sectPr>
-          <w:footerReference w:type="default" r:id="rIdFtrEmpty"/>
+          <w:footerReference w:type="default" r:id="rIdFtrNone"/>
           <w:pgSz w:w="8820" w:h="13320"/>
           <w:pgMar w:top="1530" w:right="1440" w:bottom="1530" w:left="1440" w:header="720" w:footer="720" w:gutter="0"/>
           <w:pgNumType w:fmt="decimal"/>
@@ -1557,7 +1557,7 @@
       <w:pPr>
         <w:pStyle w:val="SectionEnd"/>
         <w:sectPr>
-          <w:footerReference w:type="default" r:id="rIdFtrFront"/>
+          <w:footerReference w:type="default" r:id="rIdFtrPage"/>
           <w:pgSz w:w="8820" w:h="13320"/>
           <w:pgMar w:top="1530" w:right="1440" w:bottom="1530" w:left="1440" w:header="720" w:footer="720" w:gutter="0"/>
           <w:pgNumType w:fmt="lowerRoman" w:start="1"/>
@@ -1602,7 +1602,7 @@
       <w:pPr>
         <w:pStyle w:val="SectionEnd"/>
         <w:sectPr>
-          <w:footerReference w:type="default" r:id="rIdFtrFront"/>
+          <w:footerReference w:type="default" r:id="rIdFtrPage"/>
           <w:pgSz w:w="8820" w:h="13320"/>
           <w:pgMar w:top="1530" w:right="1440" w:bottom="1530" w:left="1440" w:header="720" w:footer="720" w:gutter="0"/>
           <w:pgNumType w:fmt="lowerRoman"/>
@@ -1862,7 +1862,7 @@
           <w:sz w:val="24"/>
           <w:szCs w:val="24"/>
         </w:rPr>
-        <w:t xml:space="preserve">8</w:t>
+        <w:t xml:space="preserve">7</w:t>
       </w:r>
     </w:p>
     <w:p>
@@ -1929,7 +1929,7 @@
           <w:sz w:val="24"/>
           <w:szCs w:val="24"/>
         </w:rPr>
-        <w:t xml:space="preserve">8</w:t>
+        <w:t xml:space="preserve">7</w:t>
       </w:r>
     </w:p>
     <w:p>
@@ -1967,7 +1967,7 @@
           <w:sz w:val="24"/>
           <w:szCs w:val="24"/>
         </w:rPr>
-        <w:t xml:space="preserve">3</w:t>
+        <w:t xml:space="preserve">2</w:t>
       </w:r>
     </w:p>
     <w:p>
@@ -2005,7 +2005,7 @@
           <w:sz w:val="24"/>
           <w:szCs w:val="24"/>
         </w:rPr>
-        <w:t xml:space="preserve">7</w:t>
+        <w:t xml:space="preserve">6</w:t>
       </w:r>
     </w:p>
     <w:p>
@@ -2043,7 +2043,7 @@
           <w:sz w:val="24"/>
           <w:szCs w:val="24"/>
         </w:rPr>
-        <w:t xml:space="preserve">7</w:t>
+        <w:t xml:space="preserve">6</w:t>
       </w:r>
     </w:p>
     <w:p>
@@ -2137,14 +2137,14 @@
           <w:sz w:val="24"/>
           <w:szCs w:val="24"/>
         </w:rPr>
-        <w:t xml:space="preserve">5</w:t>
+        <w:t xml:space="preserve">4</w:t>
       </w:r>
     </w:p>
     <w:p>
       <w:pPr>
         <w:pStyle w:val="SectionEnd"/>
         <w:sectPr>
-          <w:footerReference w:type="default" r:id="rIdFtrFront"/>
+          <w:footerReference w:type="default" r:id="rIdFtrPage"/>
           <w:pgSz w:w="8820" w:h="13320"/>
           <w:pgMar w:top="1530" w:right="1440" w:bottom="1530" w:left="1440" w:header="720" w:footer="720" w:gutter="0"/>
           <w:pgNumType w:fmt="lowerRoman"/>
@@ -3668,7 +3668,7 @@
       <w:pPr>
         <w:pStyle w:val="SectionEnd"/>
         <w:sectPr>
-          <w:footerReference w:type="default" r:id="rIdFtrBody"/>
+          <w:footerReference w:type="default" r:id="rIdFtrPage"/>
           <w:pgSz w:w="8820" w:h="13320"/>
           <w:pgMar w:top="1530" w:right="1440" w:bottom="1530" w:left="1440" w:header="720" w:footer="720" w:gutter="0"/>
           <w:pgNumType w:fmt="decimal" w:start="1"/>
@@ -3754,7 +3754,7 @@
       </w:r>
     </w:p>
     <w:sectPr>
-      <w:footerReference w:type="default" r:id="rIdFtrEmpty"/>
+      <w:footerReference w:type="default" r:id="rIdFtrNone"/>
       <w:pgSz w:w="8820" w:h="13320"/>
       <w:pgMar w:top="1530" w:right="1440" w:bottom="1530" w:left="1440" w:header="720" w:footer="720" w:gutter="0"/>
       <w:pgNumType w:fmt="decimal"/>
@@ -3786,14 +3786,16 @@
 </w:footnotes>
 </file>
 
-<file path=word/ftr-body.xml><?xml version="1.0" encoding="utf-8"?>
+<file path=word/ftr-add.xml><?xml version="1.0" encoding="utf-8"?>
 <w:ftr xmlns:w="http://schemas.openxmlformats.org/wordprocessingml/2006/main" xmlns:r="http://schemas.openxmlformats.org/officeDocument/2006/relationships">
   <w:p>
     <w:pPr>
-      <w:spacing w:before="0" w:after="0" w:line="240" w:lineRule="auto"/>
-      <w:ind w:firstLine="0"/>
+      <w:spacing w:before="0" w:after="0"/>
       <w:jc w:val="center"/>
     </w:pPr>
+    <w:r>
+      <w:t>Add-</w:t>
+    </w:r>
     <w:r>
       <w:fldChar w:fldCharType="begin"/>
     </w:r>
@@ -3813,24 +3815,22 @@
 </w:ftr>
 </file>
 
-<file path=word/ftr-empty.xml><?xml version="1.0" encoding="utf-8"?>
+<file path=word/ftr-none.xml><?xml version="1.0" encoding="utf-8"?>
 <w:ftr xmlns:w="http://schemas.openxmlformats.org/wordprocessingml/2006/main" xmlns:r="http://schemas.openxmlformats.org/officeDocument/2006/relationships">
   <w:p>
     <w:pPr>
-      <w:spacing w:before="0" w:after="0" w:line="240" w:lineRule="auto"/>
-      <w:ind w:firstLine="0"/>
+      <w:spacing w:before="0" w:after="0"/>
       <w:jc w:val="center"/>
     </w:pPr>
   </w:p>
 </w:ftr>
 </file>
 
-<file path=word/ftr-front.xml><?xml version="1.0" encoding="utf-8"?>
+<file path=word/ftr-page.xml><?xml version="1.0" encoding="utf-8"?>
 <w:ftr xmlns:w="http://schemas.openxmlformats.org/wordprocessingml/2006/main" xmlns:r="http://schemas.openxmlformats.org/officeDocument/2006/relationships">
   <w:p>
     <w:pPr>
-      <w:spacing w:before="0" w:after="0" w:line="240" w:lineRule="auto"/>
-      <w:ind w:firstLine="0"/>
+      <w:spacing w:before="0" w:after="0"/>
       <w:jc w:val="center"/>
     </w:pPr>
     <w:r>

</xml_diff>